<commit_message>
docs: auto-translate and convert to docx
</commit_message>
<xml_diff>
--- a/TD-H9_manual_ru.docx
+++ b/TD-H9_manual_ru.docx
@@ -2,7 +2,7 @@
 <file path=word/document.xml><?xml version="1.0" encoding="utf-8"?>
 <w:document xmlns:w="http://schemas.openxmlformats.org/wordprocessingml/2006/main" xmlns:m="http://schemas.openxmlformats.org/officeDocument/2006/math" xmlns:r="http://schemas.openxmlformats.org/officeDocument/2006/relationships" xmlns:o="urn:schemas-microsoft-com:office:office" xmlns:v="urn:schemas-microsoft-com:vml" xmlns:w10="urn:schemas-microsoft-com:office:word" xmlns:a="http://schemas.openxmlformats.org/drawingml/2006/main" xmlns:pic="http://schemas.openxmlformats.org/drawingml/2006/picture" xmlns:wp="http://schemas.openxmlformats.org/drawingml/2006/wordprocessingDrawing">
   <w:body>
-    <w:bookmarkStart w:id="213" w:name="tidradio-td-h9-руководство-пользователя"/>
+    <w:bookmarkStart w:id="215" w:name="tidradio-td-h9-руководство-пользователя"/>
     <w:p>
       <w:pPr>
         <w:pStyle w:val="Heading1"/>
@@ -24965,7 +24965,7 @@
       </w:tr>
     </w:tbl>
     <w:bookmarkEnd w:id="203"/>
-    <w:bookmarkStart w:id="210" w:name="приложение-e.-программное-обеспечение"/>
+    <w:bookmarkStart w:id="212" w:name="приложение-e.-программное-обеспечение"/>
     <w:p>
       <w:pPr>
         <w:pStyle w:val="Heading2"/>
@@ -25116,6 +25116,68 @@
               <w:jc w:val="left"/>
             </w:pPr>
             <w:r>
+              <w:t xml:space="preserve">Альтернативный APRSDroid</w:t>
+            </w:r>
+          </w:p>
+        </w:tc>
+        <w:tc>
+          <w:tcPr/>
+          <w:p>
+            <w:pPr>
+              <w:pStyle w:val="Compact"/>
+              <w:jc w:val="left"/>
+            </w:pPr>
+            <w:hyperlink r:id="rId207">
+              <w:r>
+                <w:rPr>
+                  <w:rStyle w:val="Hyperlink"/>
+                </w:rPr>
+                <w:t xml:space="preserve">APRSDroid 9M2PJU Mod</w:t>
+              </w:r>
+            </w:hyperlink>
+          </w:p>
+        </w:tc>
+      </w:tr>
+      <w:tr>
+        <w:tc>
+          <w:tcPr/>
+          <w:p>
+            <w:pPr>
+              <w:pStyle w:val="Compact"/>
+              <w:jc w:val="left"/>
+            </w:pPr>
+            <w:r>
+              <w:t xml:space="preserve">Android javAPRSSrvr IGate</w:t>
+            </w:r>
+          </w:p>
+        </w:tc>
+        <w:tc>
+          <w:tcPr/>
+          <w:p>
+            <w:pPr>
+              <w:pStyle w:val="Compact"/>
+              <w:jc w:val="left"/>
+            </w:pPr>
+            <w:hyperlink r:id="rId208">
+              <w:r>
+                <w:rPr>
+                  <w:rStyle w:val="Hyperlink"/>
+                </w:rPr>
+                <w:t xml:space="preserve">javAPRSSrvr IGate</w:t>
+              </w:r>
+            </w:hyperlink>
+          </w:p>
+        </w:tc>
+      </w:tr>
+      <w:tr>
+        <w:tc>
+          <w:tcPr/>
+          <w:p>
+            <w:pPr>
+              <w:pStyle w:val="Compact"/>
+              <w:jc w:val="left"/>
+            </w:pPr>
+            <w:r>
               <w:t xml:space="preserve">Софт и прошивки</w:t>
             </w:r>
           </w:p>
@@ -25158,7 +25220,7 @@
               <w:pStyle w:val="Compact"/>
               <w:jc w:val="left"/>
             </w:pPr>
-            <w:hyperlink r:id="rId207">
+            <w:hyperlink r:id="rId209">
               <w:r>
                 <w:rPr>
                   <w:rStyle w:val="Hyperlink"/>
@@ -25191,7 +25253,7 @@
               <w:pStyle w:val="Compact"/>
               <w:jc w:val="left"/>
             </w:pPr>
-            <w:hyperlink r:id="rId208">
+            <w:hyperlink r:id="rId210">
               <w:r>
                 <w:rPr>
                   <w:rStyle w:val="Hyperlink"/>
@@ -25222,7 +25284,7 @@
               <w:pStyle w:val="Compact"/>
               <w:jc w:val="left"/>
             </w:pPr>
-            <w:hyperlink r:id="rId209">
+            <w:hyperlink r:id="rId211">
               <w:r>
                 <w:rPr>
                   <w:rStyle w:val="Hyperlink"/>
@@ -25234,8 +25296,8 @@
         </w:tc>
       </w:tr>
     </w:tbl>
-    <w:bookmarkEnd w:id="210"/>
-    <w:bookmarkStart w:id="212" w:name="приложение-f.-каналы-и-пресеты"/>
+    <w:bookmarkEnd w:id="212"/>
+    <w:bookmarkStart w:id="214" w:name="приложение-f.-каналы-и-пресеты"/>
     <w:p>
       <w:pPr>
         <w:pStyle w:val="Heading2"/>
@@ -25252,7 +25314,7 @@
         </w:numPr>
         <w:pStyle w:val="Compact"/>
       </w:pPr>
-      <w:hyperlink r:id="rId211">
+      <w:hyperlink r:id="rId213">
         <w:r>
           <w:rPr>
             <w:rStyle w:val="Hyperlink"/>
@@ -25300,8 +25362,8 @@
         <w:t xml:space="preserve">Правовая информация и полные иллюстрации — в оригинале мануала.</w:t>
       </w:r>
     </w:p>
-    <w:bookmarkEnd w:id="212"/>
-    <w:bookmarkEnd w:id="213"/>
+    <w:bookmarkEnd w:id="214"/>
+    <w:bookmarkEnd w:id="215"/>
     <w:sectPr/>
   </w:body>
 </w:document>

</xml_diff>